<commit_message>
feat: :zap: Added instructions to do the embedding process
</commit_message>
<xml_diff>
--- a/documents/functions.docx
+++ b/documents/functions.docx
@@ -9,6 +9,7 @@
         <w:ind/>
         <w:rPr>
           <w:color w:val="auto"/>
+          <w:highlight w:val="none"/>
         </w:rPr>
       </w:pPr>
       <w:r>
@@ -17,6 +18,7 @@
           <w:b/>
           <w:color w:val="auto"/>
           <w:sz w:val="25"/>
+          <w:highlight w:val="none"/>
         </w:rPr>
         <w:t xml:space="preserve"> Funções do arquivo </w:t>
       </w:r>
@@ -26,12 +28,14 @@
           <w:b/>
           <w:color w:val="auto"/>
           <w:sz w:val="23"/>
+          <w:highlight w:val="none"/>
         </w:rPr>
         <w:t xml:space="preserve">multimodal_rag_complete.py</w:t>
       </w:r>
       <w:r>
         <w:rPr>
           <w:color w:val="auto"/>
+          <w:highlight w:val="none"/>
         </w:rPr>
       </w:r>
     </w:p>
@@ -41,30 +45,35 @@
         <w:spacing/>
         <w:ind/>
         <w:rPr>
+          <w:color w:val="auto"/>
           <w:highlight w:val="none"/>
           <w14:ligatures w14:val="none"/>
         </w:rPr>
       </w:pPr>
       <w:r>
         <w:rPr>
+          <w:color w:val="auto"/>
           <w:highlight w:val="none"/>
         </w:rPr>
         <w:t xml:space="preserve">O arquivo possui </w:t>
       </w:r>
       <w:r>
         <w:rPr>
+          <w:color w:val="auto"/>
           <w:highlight w:val="none"/>
         </w:rPr>
         <w:t xml:space="preserve">15 funções</w:t>
       </w:r>
       <w:r>
         <w:rPr>
+          <w:color w:val="auto"/>
           <w:highlight w:val="none"/>
         </w:rPr>
         <w:t xml:space="preserve"> organizadas em diferentes categorias:</w:t>
       </w:r>
       <w:r>
         <w:rPr>
+          <w:color w:val="auto"/>
           <w:highlight w:val="none"/>
         </w:rPr>
       </w:r>
@@ -76,6 +85,7 @@
         <w:ind/>
         <w:rPr>
           <w:color w:val="auto"/>
+          <w:highlight w:val="none"/>
         </w:rPr>
       </w:pPr>
       <w:r>
@@ -84,12 +94,14 @@
           <w:b/>
           <w:color w:val="auto"/>
           <w:sz w:val="22"/>
+          <w:highlight w:val="none"/>
         </w:rPr>
         <w:t xml:space="preserve">🔧 Funções de Utilitários</w:t>
       </w:r>
       <w:r>
         <w:rPr>
           <w:color w:val="auto"/>
+          <w:highlight w:val="none"/>
         </w:rPr>
       </w:r>
     </w:p>
@@ -100,6 +112,7 @@
         <w:ind/>
         <w:rPr>
           <w:color w:val="auto"/>
+          <w:highlight w:val="none"/>
         </w:rPr>
       </w:pPr>
       <w:r>
@@ -107,6 +120,7 @@
           <w:rFonts w:ascii="Droid Sans Mono" w:hAnsi="Droid Sans Mono" w:eastAsia="Droid Sans Mono" w:cs="Droid Sans Mono"/>
           <w:color w:val="auto"/>
           <w:sz w:val="18"/>
+          <w:highlight w:val="none"/>
         </w:rPr>
         <w:t xml:space="preserve">set_global_variable()</w:t>
       </w:r>
@@ -115,12 +129,14 @@
           <w:rFonts w:ascii="Liberation Sans" w:hAnsi="Liberation Sans" w:eastAsia="Liberation Sans" w:cs="Liberation Sans"/>
           <w:color w:val="auto"/>
           <w:sz w:val="20"/>
+          <w:highlight w:val="none"/>
         </w:rPr>
         <w:t xml:space="preserve"> - Define variáveis globais</w:t>
       </w:r>
       <w:r>
         <w:rPr>
           <w:color w:val="auto"/>
+          <w:highlight w:val="none"/>
         </w:rPr>
       </w:r>
     </w:p>
@@ -131,6 +147,7 @@
         <w:ind/>
         <w:rPr>
           <w:color w:val="auto"/>
+          <w:highlight w:val="none"/>
         </w:rPr>
       </w:pPr>
       <w:r>
@@ -138,6 +155,7 @@
           <w:rFonts w:ascii="Droid Sans Mono" w:hAnsi="Droid Sans Mono" w:eastAsia="Droid Sans Mono" w:cs="Droid Sans Mono"/>
           <w:color w:val="auto"/>
           <w:sz w:val="18"/>
+          <w:highlight w:val="none"/>
         </w:rPr>
         <w:t xml:space="preserve">get_text_embedding_from_text_embedding_model()</w:t>
       </w:r>
@@ -146,12 +164,14 @@
           <w:rFonts w:ascii="Liberation Sans" w:hAnsi="Liberation Sans" w:eastAsia="Liberation Sans" w:cs="Liberation Sans"/>
           <w:color w:val="auto"/>
           <w:sz w:val="20"/>
+          <w:highlight w:val="none"/>
         </w:rPr>
         <w:t xml:space="preserve"> - Gera embeddings de texto</w:t>
       </w:r>
       <w:r>
         <w:rPr>
           <w:color w:val="auto"/>
+          <w:highlight w:val="none"/>
         </w:rPr>
       </w:r>
     </w:p>
@@ -162,6 +182,7 @@
         <w:ind/>
         <w:rPr>
           <w:color w:val="auto"/>
+          <w:highlight w:val="none"/>
         </w:rPr>
       </w:pPr>
       <w:r>
@@ -169,6 +190,7 @@
           <w:rFonts w:ascii="Droid Sans Mono" w:hAnsi="Droid Sans Mono" w:eastAsia="Droid Sans Mono" w:cs="Droid Sans Mono"/>
           <w:color w:val="auto"/>
           <w:sz w:val="18"/>
+          <w:highlight w:val="none"/>
         </w:rPr>
         <w:t xml:space="preserve">get_image_embedding_from_multimodal_embedding_model()</w:t>
       </w:r>
@@ -177,12 +199,14 @@
           <w:rFonts w:ascii="Liberation Sans" w:hAnsi="Liberation Sans" w:eastAsia="Liberation Sans" w:cs="Liberation Sans"/>
           <w:color w:val="auto"/>
           <w:sz w:val="20"/>
+          <w:highlight w:val="none"/>
         </w:rPr>
         <w:t xml:space="preserve"> - Gera embeddings de imagem</w:t>
       </w:r>
       <w:r>
         <w:rPr>
           <w:color w:val="auto"/>
+          <w:highlight w:val="none"/>
         </w:rPr>
       </w:r>
     </w:p>
@@ -193,6 +217,7 @@
         <w:ind/>
         <w:rPr>
           <w:color w:val="auto"/>
+          <w:highlight w:val="none"/>
         </w:rPr>
       </w:pPr>
       <w:r>
@@ -200,6 +225,7 @@
           <w:rFonts w:ascii="Droid Sans Mono" w:hAnsi="Droid Sans Mono" w:eastAsia="Droid Sans Mono" w:cs="Droid Sans Mono"/>
           <w:color w:val="auto"/>
           <w:sz w:val="18"/>
+          <w:highlight w:val="none"/>
         </w:rPr>
         <w:t xml:space="preserve">get_gemini_response()</w:t>
       </w:r>
@@ -208,12 +234,14 @@
           <w:rFonts w:ascii="Liberation Sans" w:hAnsi="Liberation Sans" w:eastAsia="Liberation Sans" w:cs="Liberation Sans"/>
           <w:color w:val="auto"/>
           <w:sz w:val="20"/>
+          <w:highlight w:val="none"/>
         </w:rPr>
         <w:t xml:space="preserve"> - Obtém respostas do modelo Gemini</w:t>
       </w:r>
       <w:r>
         <w:rPr>
           <w:color w:val="auto"/>
+          <w:highlight w:val="none"/>
         </w:rPr>
       </w:r>
     </w:p>
@@ -224,6 +252,7 @@
         <w:ind/>
         <w:rPr>
           <w:color w:val="auto"/>
+          <w:highlight w:val="none"/>
         </w:rPr>
       </w:pPr>
       <w:r>
@@ -231,6 +260,7 @@
           <w:rFonts w:ascii="Droid Sans Mono" w:hAnsi="Droid Sans Mono" w:eastAsia="Droid Sans Mono" w:cs="Droid Sans Mono"/>
           <w:color w:val="auto"/>
           <w:sz w:val="18"/>
+          <w:highlight w:val="none"/>
         </w:rPr>
         <w:t xml:space="preserve">get_cosine_score()</w:t>
       </w:r>
@@ -239,12 +269,14 @@
           <w:rFonts w:ascii="Liberation Sans" w:hAnsi="Liberation Sans" w:eastAsia="Liberation Sans" w:cs="Liberation Sans"/>
           <w:color w:val="auto"/>
           <w:sz w:val="20"/>
+          <w:highlight w:val="none"/>
         </w:rPr>
         <w:t xml:space="preserve"> - Calcula similaridade coseno</w:t>
       </w:r>
       <w:r>
         <w:rPr>
           <w:color w:val="auto"/>
+          <w:highlight w:val="none"/>
         </w:rPr>
       </w:r>
     </w:p>
@@ -255,6 +287,7 @@
         <w:ind/>
         <w:rPr>
           <w:color w:val="auto"/>
+          <w:highlight w:val="none"/>
         </w:rPr>
       </w:pPr>
       <w:r>
@@ -263,12 +296,14 @@
           <w:b/>
           <w:color w:val="auto"/>
           <w:sz w:val="22"/>
+          <w:highlight w:val="none"/>
         </w:rPr>
         <w:t xml:space="preserve">🔍 Funções de Busca e Similaridade</w:t>
       </w:r>
       <w:r>
         <w:rPr>
           <w:color w:val="auto"/>
+          <w:highlight w:val="none"/>
         </w:rPr>
       </w:r>
     </w:p>
@@ -279,6 +314,7 @@
         <w:ind/>
         <w:rPr>
           <w:color w:val="auto"/>
+          <w:highlight w:val="none"/>
         </w:rPr>
       </w:pPr>
       <w:r>
@@ -286,6 +322,7 @@
           <w:rFonts w:ascii="Droid Sans Mono" w:hAnsi="Droid Sans Mono" w:eastAsia="Droid Sans Mono" w:cs="Droid Sans Mono"/>
           <w:color w:val="auto"/>
           <w:sz w:val="18"/>
+          <w:highlight w:val="none"/>
         </w:rPr>
         <w:t xml:space="preserve">buscar_imagens_similares_com_embedding()</w:t>
       </w:r>
@@ -294,12 +331,14 @@
           <w:rFonts w:ascii="Liberation Sans" w:hAnsi="Liberation Sans" w:eastAsia="Liberation Sans" w:cs="Liberation Sans"/>
           <w:color w:val="auto"/>
           <w:sz w:val="20"/>
+          <w:highlight w:val="none"/>
         </w:rPr>
         <w:t xml:space="preserve"> - Busca imagens similares usando embeddings</w:t>
       </w:r>
       <w:r>
         <w:rPr>
           <w:color w:val="auto"/>
+          <w:highlight w:val="none"/>
         </w:rPr>
       </w:r>
     </w:p>
@@ -310,6 +349,7 @@
         <w:ind/>
         <w:rPr>
           <w:color w:val="auto"/>
+          <w:highlight w:val="none"/>
         </w:rPr>
       </w:pPr>
       <w:r>
@@ -318,12 +358,14 @@
           <w:b/>
           <w:color w:val="auto"/>
           <w:sz w:val="22"/>
+          <w:highlight w:val="none"/>
         </w:rPr>
         <w:t xml:space="preserve">📄 Funções de Processamento de Documentos</w:t>
       </w:r>
       <w:r>
         <w:rPr>
           <w:color w:val="auto"/>
+          <w:highlight w:val="none"/>
         </w:rPr>
       </w:r>
     </w:p>
@@ -334,6 +376,7 @@
         <w:ind/>
         <w:rPr>
           <w:color w:val="auto"/>
+          <w:highlight w:val="none"/>
         </w:rPr>
       </w:pPr>
       <w:r>
@@ -341,6 +384,7 @@
           <w:rFonts w:ascii="Droid Sans Mono" w:hAnsi="Droid Sans Mono" w:eastAsia="Droid Sans Mono" w:cs="Droid Sans Mono"/>
           <w:color w:val="auto"/>
           <w:sz w:val="18"/>
+          <w:highlight w:val="none"/>
         </w:rPr>
         <w:t xml:space="preserve">extrair_imagens_do_pdf()</w:t>
       </w:r>
@@ -349,12 +393,14 @@
           <w:rFonts w:ascii="Liberation Sans" w:hAnsi="Liberation Sans" w:eastAsia="Liberation Sans" w:cs="Liberation Sans"/>
           <w:color w:val="auto"/>
           <w:sz w:val="20"/>
+          <w:highlight w:val="none"/>
         </w:rPr>
         <w:t xml:space="preserve"> - Extrai imagens de arquivos PDF</w:t>
       </w:r>
       <w:r>
         <w:rPr>
           <w:color w:val="auto"/>
+          <w:highlight w:val="none"/>
         </w:rPr>
       </w:r>
     </w:p>
@@ -365,6 +411,7 @@
         <w:ind/>
         <w:rPr>
           <w:color w:val="auto"/>
+          <w:highlight w:val="none"/>
         </w:rPr>
       </w:pPr>
       <w:r>
@@ -372,6 +419,7 @@
           <w:rFonts w:ascii="Droid Sans Mono" w:hAnsi="Droid Sans Mono" w:eastAsia="Droid Sans Mono" w:cs="Droid Sans Mono"/>
           <w:color w:val="auto"/>
           <w:sz w:val="18"/>
+          <w:highlight w:val="none"/>
         </w:rPr>
         <w:t xml:space="preserve">processar_imagens_da_pasta()</w:t>
       </w:r>
@@ -380,12 +428,14 @@
           <w:rFonts w:ascii="Liberation Sans" w:hAnsi="Liberation Sans" w:eastAsia="Liberation Sans" w:cs="Liberation Sans"/>
           <w:color w:val="auto"/>
           <w:sz w:val="20"/>
+          <w:highlight w:val="none"/>
         </w:rPr>
         <w:t xml:space="preserve"> - Processa todas as imagens de uma pasta</w:t>
       </w:r>
       <w:r>
         <w:rPr>
           <w:color w:val="auto"/>
+          <w:highlight w:val="none"/>
         </w:rPr>
       </w:r>
     </w:p>
@@ -396,6 +446,7 @@
         <w:ind/>
         <w:rPr>
           <w:color w:val="auto"/>
+          <w:highlight w:val="none"/>
         </w:rPr>
       </w:pPr>
       <w:r>
@@ -404,12 +455,14 @@
           <w:b/>
           <w:color w:val="auto"/>
           <w:sz w:val="22"/>
+          <w:highlight w:val="none"/>
         </w:rPr>
         <w:t xml:space="preserve">🔬 Funções de Análise e Validação</w:t>
       </w:r>
       <w:r>
         <w:rPr>
           <w:color w:val="auto"/>
+          <w:highlight w:val="none"/>
         </w:rPr>
       </w:r>
     </w:p>
@@ -420,6 +473,7 @@
         <w:ind/>
         <w:rPr>
           <w:color w:val="auto"/>
+          <w:highlight w:val="none"/>
         </w:rPr>
       </w:pPr>
       <w:r>
@@ -427,6 +481,7 @@
           <w:rFonts w:ascii="Droid Sans Mono" w:hAnsi="Droid Sans Mono" w:eastAsia="Droid Sans Mono" w:cs="Droid Sans Mono"/>
           <w:color w:val="auto"/>
           <w:sz w:val="18"/>
+          <w:highlight w:val="none"/>
         </w:rPr>
         <w:t xml:space="preserve">validar_busca_similaridade()</w:t>
       </w:r>
@@ -435,12 +490,14 @@
           <w:rFonts w:ascii="Liberation Sans" w:hAnsi="Liberation Sans" w:eastAsia="Liberation Sans" w:cs="Liberation Sans"/>
           <w:color w:val="auto"/>
           <w:sz w:val="20"/>
+          <w:highlight w:val="none"/>
         </w:rPr>
         <w:t xml:space="preserve"> - Valida sistema de busca por similaridade</w:t>
       </w:r>
       <w:r>
         <w:rPr>
           <w:color w:val="auto"/>
+          <w:highlight w:val="none"/>
         </w:rPr>
       </w:r>
     </w:p>
@@ -451,6 +508,7 @@
         <w:ind/>
         <w:rPr>
           <w:color w:val="auto"/>
+          <w:highlight w:val="none"/>
         </w:rPr>
       </w:pPr>
       <w:r>
@@ -458,6 +516,7 @@
           <w:rFonts w:ascii="Droid Sans Mono" w:hAnsi="Droid Sans Mono" w:eastAsia="Droid Sans Mono" w:cs="Droid Sans Mono"/>
           <w:color w:val="auto"/>
           <w:sz w:val="18"/>
+          <w:highlight w:val="none"/>
         </w:rPr>
         <w:t xml:space="preserve">analise_contextual_com_gemini()</w:t>
       </w:r>
@@ -466,12 +525,14 @@
           <w:rFonts w:ascii="Liberation Sans" w:hAnsi="Liberation Sans" w:eastAsia="Liberation Sans" w:cs="Liberation Sans"/>
           <w:color w:val="auto"/>
           <w:sz w:val="20"/>
+          <w:highlight w:val="none"/>
         </w:rPr>
         <w:t xml:space="preserve"> - Análise contextual usando Gemini</w:t>
       </w:r>
       <w:r>
         <w:rPr>
           <w:color w:val="auto"/>
+          <w:highlight w:val="none"/>
         </w:rPr>
       </w:r>
     </w:p>
@@ -482,6 +543,7 @@
         <w:ind/>
         <w:rPr>
           <w:color w:val="auto"/>
+          <w:highlight w:val="none"/>
         </w:rPr>
       </w:pPr>
       <w:r>
@@ -489,6 +551,7 @@
           <w:rFonts w:ascii="Droid Sans Mono" w:hAnsi="Droid Sans Mono" w:eastAsia="Droid Sans Mono" w:cs="Droid Sans Mono"/>
           <w:color w:val="auto"/>
           <w:sz w:val="18"/>
+          <w:highlight w:val="none"/>
         </w:rPr>
         <w:t xml:space="preserve">analise_direta_com_gemini()</w:t>
       </w:r>
@@ -497,12 +560,14 @@
           <w:rFonts w:ascii="Liberation Sans" w:hAnsi="Liberation Sans" w:eastAsia="Liberation Sans" w:cs="Liberation Sans"/>
           <w:color w:val="auto"/>
           <w:sz w:val="20"/>
+          <w:highlight w:val="none"/>
         </w:rPr>
         <w:t xml:space="preserve"> - Análise direta de imagem com Gemini</w:t>
       </w:r>
       <w:r>
         <w:rPr>
           <w:color w:val="auto"/>
+          <w:highlight w:val="none"/>
         </w:rPr>
       </w:r>
     </w:p>
@@ -513,6 +578,7 @@
         <w:ind/>
         <w:rPr>
           <w:color w:val="auto"/>
+          <w:highlight w:val="none"/>
         </w:rPr>
       </w:pPr>
       <w:r>
@@ -521,12 +587,14 @@
           <w:b/>
           <w:color w:val="auto"/>
           <w:sz w:val="22"/>
+          <w:highlight w:val="none"/>
         </w:rPr>
         <w:t xml:space="preserve">⚙️ Funções de Inicialização e Controle</w:t>
       </w:r>
       <w:r>
         <w:rPr>
           <w:color w:val="auto"/>
+          <w:highlight w:val="none"/>
         </w:rPr>
       </w:r>
     </w:p>
@@ -537,6 +605,7 @@
         <w:ind/>
         <w:rPr>
           <w:color w:val="auto"/>
+          <w:highlight w:val="none"/>
         </w:rPr>
       </w:pPr>
       <w:r>
@@ -544,6 +613,7 @@
           <w:rFonts w:ascii="Droid Sans Mono" w:hAnsi="Droid Sans Mono" w:eastAsia="Droid Sans Mono" w:cs="Droid Sans Mono"/>
           <w:color w:val="auto"/>
           <w:sz w:val="18"/>
+          <w:highlight w:val="none"/>
         </w:rPr>
         <w:t xml:space="preserve">inicializar_modelos()</w:t>
       </w:r>
@@ -552,12 +622,14 @@
           <w:rFonts w:ascii="Liberation Sans" w:hAnsi="Liberation Sans" w:eastAsia="Liberation Sans" w:cs="Liberation Sans"/>
           <w:color w:val="auto"/>
           <w:sz w:val="20"/>
+          <w:highlight w:val="none"/>
         </w:rPr>
         <w:t xml:space="preserve"> - Inicializa todos os modelos necessários</w:t>
       </w:r>
       <w:r>
         <w:rPr>
           <w:color w:val="auto"/>
+          <w:highlight w:val="none"/>
         </w:rPr>
       </w:r>
     </w:p>
@@ -568,6 +640,7 @@
         <w:ind/>
         <w:rPr>
           <w:color w:val="auto"/>
+          <w:highlight w:val="none"/>
         </w:rPr>
       </w:pPr>
       <w:r>
@@ -575,6 +648,7 @@
           <w:rFonts w:ascii="Droid Sans Mono" w:hAnsi="Droid Sans Mono" w:eastAsia="Droid Sans Mono" w:cs="Droid Sans Mono"/>
           <w:color w:val="auto"/>
           <w:sz w:val="18"/>
+          <w:highlight w:val="none"/>
         </w:rPr>
         <w:t xml:space="preserve">executar_fluxo_completo()</w:t>
       </w:r>
@@ -583,12 +657,14 @@
           <w:rFonts w:ascii="Liberation Sans" w:hAnsi="Liberation Sans" w:eastAsia="Liberation Sans" w:cs="Liberation Sans"/>
           <w:color w:val="auto"/>
           <w:sz w:val="20"/>
+          <w:highlight w:val="none"/>
         </w:rPr>
         <w:t xml:space="preserve"> - Executa o fluxo completo do sistema RAG</w:t>
       </w:r>
       <w:r>
         <w:rPr>
           <w:color w:val="auto"/>
+          <w:highlight w:val="none"/>
         </w:rPr>
       </w:r>
     </w:p>
@@ -599,6 +675,7 @@
         <w:ind/>
         <w:rPr>
           <w:color w:val="auto"/>
+          <w:highlight w:val="none"/>
         </w:rPr>
       </w:pPr>
       <w:r>
@@ -607,12 +684,14 @@
           <w:b/>
           <w:color w:val="auto"/>
           <w:sz w:val="22"/>
+          <w:highlight w:val="none"/>
         </w:rPr>
         <w:t xml:space="preserve">🖥️ Funções de Interface</w:t>
       </w:r>
       <w:r>
         <w:rPr>
           <w:color w:val="auto"/>
+          <w:highlight w:val="none"/>
         </w:rPr>
       </w:r>
     </w:p>
@@ -623,6 +702,7 @@
         <w:ind/>
         <w:rPr>
           <w:color w:val="auto"/>
+          <w:highlight w:val="none"/>
         </w:rPr>
       </w:pPr>
       <w:r>
@@ -630,6 +710,7 @@
           <w:rFonts w:ascii="Droid Sans Mono" w:hAnsi="Droid Sans Mono" w:eastAsia="Droid Sans Mono" w:cs="Droid Sans Mono"/>
           <w:color w:val="auto"/>
           <w:sz w:val="18"/>
+          <w:highlight w:val="none"/>
         </w:rPr>
         <w:t xml:space="preserve">criar_parser()</w:t>
       </w:r>
@@ -638,12 +719,14 @@
           <w:rFonts w:ascii="Liberation Sans" w:hAnsi="Liberation Sans" w:eastAsia="Liberation Sans" w:cs="Liberation Sans"/>
           <w:color w:val="auto"/>
           <w:sz w:val="20"/>
+          <w:highlight w:val="none"/>
         </w:rPr>
         <w:t xml:space="preserve"> - Cria parser de argumentos da linha de comando</w:t>
       </w:r>
       <w:r>
         <w:rPr>
           <w:color w:val="auto"/>
+          <w:highlight w:val="none"/>
         </w:rPr>
       </w:r>
     </w:p>
@@ -724,6 +807,809 @@
         </w:rPr>
       </w:r>
     </w:p>
+    <w:p>
+      <w:pPr>
+        <w:pBdr/>
+        <w:spacing/>
+        <w:ind/>
+        <w:rPr>
+          <w:color w:val="auto"/>
+          <w:highlight w:val="none"/>
+        </w:rPr>
+      </w:pPr>
+      <w:r>
+        <w:rPr>
+          <w:color w:val="auto"/>
+          <w:highlight w:val="none"/>
+        </w:rPr>
+      </w:r>
+      <w:r>
+        <w:rPr>
+          <w:color w:val="auto"/>
+          <w:highlight w:val="none"/>
+        </w:rPr>
+      </w:r>
+      <w:r>
+        <w:rPr>
+          <w:color w:val="auto"/>
+          <w:highlight w:val="none"/>
+        </w:rPr>
+      </w:r>
+    </w:p>
+    <w:p>
+      <w:pPr>
+        <w:pBdr/>
+        <w:spacing/>
+        <w:ind/>
+        <w:rPr>
+          <w:color w:val="auto"/>
+          <w:highlight w:val="none"/>
+        </w:rPr>
+      </w:pPr>
+      <w:r>
+        <w:rPr>
+          <w:color w:val="auto"/>
+          <w:highlight w:val="none"/>
+        </w:rPr>
+        <w:br w:type="page" w:clear="all"/>
+      </w:r>
+      <w:r>
+        <w:rPr>
+          <w:rFonts w:ascii="Liberation Sans" w:hAnsi="Liberation Sans" w:eastAsia="Liberation Sans" w:cs="Liberation Sans"/>
+          <w:b/>
+          <w:color w:val="auto"/>
+          <w:sz w:val="25"/>
+          <w:highlight w:val="none"/>
+        </w:rPr>
+        <w:t xml:space="preserve">Fluxo de Execução Revisado da Fase 1</w:t>
+      </w:r>
+      <w:r>
+        <w:rPr>
+          <w:color w:val="auto"/>
+          <w:highlight w:val="none"/>
+        </w:rPr>
+      </w:r>
+    </w:p>
+    <w:p>
+      <w:pPr>
+        <w:pBdr/>
+        <w:spacing/>
+        <w:ind/>
+        <w:rPr>
+          <w:color w:val="auto"/>
+          <w:highlight w:val="none"/>
+        </w:rPr>
+      </w:pPr>
+      <w:r>
+        <w:rPr>
+          <w:rFonts w:ascii="Liberation Sans" w:hAnsi="Liberation Sans" w:eastAsia="Liberation Sans" w:cs="Liberation Sans"/>
+          <w:b/>
+          <w:color w:val="auto"/>
+          <w:sz w:val="22"/>
+          <w:highlight w:val="none"/>
+        </w:rPr>
+        <w:t xml:space="preserve">Passo 1: Carregamento de Configurações</w:t>
+      </w:r>
+      <w:r>
+        <w:rPr>
+          <w:color w:val="auto"/>
+          <w:highlight w:val="none"/>
+        </w:rPr>
+      </w:r>
+    </w:p>
+    <w:p>
+      <w:pPr>
+        <w:pBdr/>
+        <w:spacing/>
+        <w:ind/>
+        <w:rPr>
+          <w:color w:val="auto"/>
+          <w:highlight w:val="none"/>
+        </w:rPr>
+      </w:pPr>
+      <w:r>
+        <w:rPr>
+          <w:rFonts w:ascii="Liberation Sans" w:hAnsi="Liberation Sans" w:eastAsia="Liberation Sans" w:cs="Liberation Sans"/>
+          <w:b/>
+          <w:color w:val="auto"/>
+          <w:sz w:val="20"/>
+          <w:highlight w:val="none"/>
+        </w:rPr>
+        <w:t xml:space="preserve">Carregar variáveis de ambiente</w:t>
+      </w:r>
+      <w:r>
+        <w:rPr>
+          <w:rFonts w:ascii="Liberation Sans" w:hAnsi="Liberation Sans" w:eastAsia="Liberation Sans" w:cs="Liberation Sans"/>
+          <w:color w:val="auto"/>
+          <w:sz w:val="20"/>
+          <w:highlight w:val="none"/>
+        </w:rPr>
+        <w:t xml:space="preserve"> (.env)</w:t>
+      </w:r>
+      <w:r>
+        <w:rPr>
+          <w:color w:val="auto"/>
+          <w:highlight w:val="none"/>
+        </w:rPr>
+      </w:r>
+    </w:p>
+    <w:p>
+      <w:pPr>
+        <w:pBdr/>
+        <w:spacing/>
+        <w:ind/>
+        <w:rPr>
+          <w:color w:val="auto"/>
+          <w:highlight w:val="none"/>
+        </w:rPr>
+      </w:pPr>
+      <w:r>
+        <w:rPr>
+          <w:rFonts w:ascii="Liberation Sans" w:hAnsi="Liberation Sans" w:eastAsia="Liberation Sans" w:cs="Liberation Sans"/>
+          <w:b/>
+          <w:color w:val="auto"/>
+          <w:sz w:val="20"/>
+          <w:highlight w:val="none"/>
+        </w:rPr>
+        <w:t xml:space="preserve">Validar configurações obrigatórias</w:t>
+      </w:r>
+      <w:r>
+        <w:rPr>
+          <w:color w:val="auto"/>
+          <w:highlight w:val="none"/>
+        </w:rPr>
+      </w:r>
+    </w:p>
+    <w:p>
+      <w:pPr>
+        <w:pBdr/>
+        <w:spacing/>
+        <w:ind/>
+        <w:rPr>
+          <w:color w:val="auto"/>
+          <w:highlight w:val="none"/>
+        </w:rPr>
+      </w:pPr>
+      <w:r>
+        <w:rPr>
+          <w:rFonts w:ascii="Liberation Sans" w:hAnsi="Liberation Sans" w:eastAsia="Liberation Sans" w:cs="Liberation Sans"/>
+          <w:b/>
+          <w:color w:val="auto"/>
+          <w:sz w:val="20"/>
+          <w:highlight w:val="none"/>
+        </w:rPr>
+        <w:t xml:space="preserve">Definir parâmetros padrão</w:t>
+      </w:r>
+      <w:r>
+        <w:rPr>
+          <w:color w:val="auto"/>
+          <w:highlight w:val="none"/>
+        </w:rPr>
+      </w:r>
+    </w:p>
+    <w:p>
+      <w:pPr>
+        <w:pBdr/>
+        <w:spacing/>
+        <w:ind/>
+        <w:rPr>
+          <w:color w:val="auto"/>
+          <w:highlight w:val="none"/>
+        </w:rPr>
+      </w:pPr>
+      <w:r>
+        <w:rPr>
+          <w:rFonts w:ascii="Liberation Sans" w:hAnsi="Liberation Sans" w:eastAsia="Liberation Sans" w:cs="Liberation Sans"/>
+          <w:b/>
+          <w:color w:val="auto"/>
+          <w:sz w:val="20"/>
+          <w:highlight w:val="none"/>
+        </w:rPr>
+        <w:t xml:space="preserve">Configurar diretórios necessários</w:t>
+      </w:r>
+      <w:r>
+        <w:rPr>
+          <w:color w:val="auto"/>
+          <w:highlight w:val="none"/>
+        </w:rPr>
+      </w:r>
+    </w:p>
+    <w:p>
+      <w:pPr>
+        <w:pBdr/>
+        <w:spacing/>
+        <w:ind/>
+        <w:rPr>
+          <w:color w:val="auto"/>
+          <w:highlight w:val="none"/>
+        </w:rPr>
+      </w:pPr>
+      <w:r>
+        <w:rPr>
+          <w:rFonts w:ascii="Liberation Sans" w:hAnsi="Liberation Sans" w:eastAsia="Liberation Sans" w:cs="Liberation Sans"/>
+          <w:b/>
+          <w:color w:val="auto"/>
+          <w:sz w:val="22"/>
+          <w:highlight w:val="none"/>
+        </w:rPr>
+        <w:t xml:space="preserve">Passo 2: Inicialização do Vertex AI</w:t>
+      </w:r>
+      <w:r>
+        <w:rPr>
+          <w:color w:val="auto"/>
+          <w:highlight w:val="none"/>
+        </w:rPr>
+      </w:r>
+    </w:p>
+    <w:p>
+      <w:pPr>
+        <w:pBdr/>
+        <w:spacing/>
+        <w:ind/>
+        <w:rPr>
+          <w:color w:val="auto"/>
+          <w:highlight w:val="none"/>
+        </w:rPr>
+      </w:pPr>
+      <w:r>
+        <w:rPr>
+          <w:rFonts w:ascii="Liberation Sans" w:hAnsi="Liberation Sans" w:eastAsia="Liberation Sans" w:cs="Liberation Sans"/>
+          <w:b/>
+          <w:color w:val="auto"/>
+          <w:sz w:val="20"/>
+          <w:highlight w:val="none"/>
+        </w:rPr>
+        <w:t xml:space="preserve">Configurar projeto Google Cloud</w:t>
+      </w:r>
+      <w:r>
+        <w:rPr>
+          <w:color w:val="auto"/>
+          <w:highlight w:val="none"/>
+        </w:rPr>
+      </w:r>
+    </w:p>
+    <w:p>
+      <w:pPr>
+        <w:pBdr/>
+        <w:spacing/>
+        <w:ind/>
+        <w:rPr>
+          <w:color w:val="auto"/>
+          <w:highlight w:val="none"/>
+        </w:rPr>
+      </w:pPr>
+      <w:r>
+        <w:rPr>
+          <w:rFonts w:ascii="Liberation Sans" w:hAnsi="Liberation Sans" w:eastAsia="Liberation Sans" w:cs="Liberation Sans"/>
+          <w:b/>
+          <w:color w:val="auto"/>
+          <w:sz w:val="20"/>
+          <w:highlight w:val="none"/>
+        </w:rPr>
+        <w:t xml:space="preserve">Inicializar Vertex AI</w:t>
+      </w:r>
+      <w:r>
+        <w:rPr>
+          <w:color w:val="auto"/>
+          <w:highlight w:val="none"/>
+        </w:rPr>
+      </w:r>
+    </w:p>
+    <w:p>
+      <w:pPr>
+        <w:pBdr/>
+        <w:spacing/>
+        <w:ind/>
+        <w:rPr>
+          <w:color w:val="auto"/>
+          <w:highlight w:val="none"/>
+        </w:rPr>
+      </w:pPr>
+      <w:r>
+        <w:rPr>
+          <w:rFonts w:ascii="Liberation Sans" w:hAnsi="Liberation Sans" w:eastAsia="Liberation Sans" w:cs="Liberation Sans"/>
+          <w:b/>
+          <w:color w:val="auto"/>
+          <w:sz w:val="20"/>
+          <w:highlight w:val="none"/>
+        </w:rPr>
+        <w:t xml:space="preserve">Verificar permissões do projeto</w:t>
+      </w:r>
+      <w:r>
+        <w:rPr>
+          <w:color w:val="auto"/>
+          <w:highlight w:val="none"/>
+        </w:rPr>
+      </w:r>
+    </w:p>
+    <w:p>
+      <w:pPr>
+        <w:pBdr/>
+        <w:spacing/>
+        <w:ind/>
+        <w:rPr>
+          <w:color w:val="auto"/>
+          <w:highlight w:val="none"/>
+        </w:rPr>
+      </w:pPr>
+      <w:r>
+        <w:rPr>
+          <w:rFonts w:ascii="Liberation Sans" w:hAnsi="Liberation Sans" w:eastAsia="Liberation Sans" w:cs="Liberation Sans"/>
+          <w:b/>
+          <w:color w:val="auto"/>
+          <w:sz w:val="20"/>
+          <w:highlight w:val="none"/>
+        </w:rPr>
+        <w:t xml:space="preserve">Validar localização (us-central1)</w:t>
+      </w:r>
+      <w:r>
+        <w:rPr>
+          <w:color w:val="auto"/>
+          <w:highlight w:val="none"/>
+        </w:rPr>
+      </w:r>
+    </w:p>
+    <w:p>
+      <w:pPr>
+        <w:pBdr/>
+        <w:spacing/>
+        <w:ind/>
+        <w:rPr>
+          <w:color w:val="auto"/>
+          <w:highlight w:val="none"/>
+        </w:rPr>
+      </w:pPr>
+      <w:r>
+        <w:rPr>
+          <w:rFonts w:ascii="Liberation Sans" w:hAnsi="Liberation Sans" w:eastAsia="Liberation Sans" w:cs="Liberation Sans"/>
+          <w:b/>
+          <w:color w:val="auto"/>
+          <w:sz w:val="22"/>
+          <w:highlight w:val="none"/>
+        </w:rPr>
+        <w:t xml:space="preserve">Passo 3: Carregamento de Modelos Gemini (REVISADO)</w:t>
+      </w:r>
+      <w:r>
+        <w:rPr>
+          <w:color w:val="auto"/>
+          <w:highlight w:val="none"/>
+        </w:rPr>
+      </w:r>
+    </w:p>
+    <w:p>
+      <w:pPr>
+        <w:pBdr/>
+        <w:spacing/>
+        <w:ind/>
+        <w:rPr>
+          <w:color w:val="auto"/>
+          <w:highlight w:val="none"/>
+        </w:rPr>
+      </w:pPr>
+      <w:r>
+        <w:rPr>
+          <w:rFonts w:ascii="Liberation Sans" w:hAnsi="Liberation Sans" w:eastAsia="Liberation Sans" w:cs="Liberation Sans"/>
+          <w:b/>
+          <w:color w:val="auto"/>
+          <w:sz w:val="20"/>
+          <w:highlight w:val="none"/>
+        </w:rPr>
+        <w:t xml:space="preserve">Inicializar apenas Gemini 2.5 Pro</w:t>
+      </w:r>
+      <w:r>
+        <w:rPr>
+          <w:color w:val="auto"/>
+          <w:highlight w:val="none"/>
+        </w:rPr>
+      </w:r>
+    </w:p>
+    <w:p>
+      <w:pPr>
+        <w:pBdr/>
+        <w:spacing/>
+        <w:ind/>
+        <w:rPr>
+          <w:color w:val="auto"/>
+          <w:highlight w:val="none"/>
+        </w:rPr>
+      </w:pPr>
+      <w:r>
+        <w:rPr>
+          <w:rFonts w:ascii="Liberation Sans" w:hAnsi="Liberation Sans" w:eastAsia="Liberation Sans" w:cs="Liberation Sans"/>
+          <w:b/>
+          <w:color w:val="auto"/>
+          <w:sz w:val="20"/>
+          <w:highlight w:val="none"/>
+        </w:rPr>
+        <w:t xml:space="preserve">Testar disponibilidade do modelo</w:t>
+      </w:r>
+      <w:r>
+        <w:rPr>
+          <w:color w:val="auto"/>
+          <w:highlight w:val="none"/>
+        </w:rPr>
+      </w:r>
+    </w:p>
+    <w:p>
+      <w:pPr>
+        <w:pBdr/>
+        <w:spacing/>
+        <w:ind/>
+        <w:rPr>
+          <w:color w:val="auto"/>
+          <w:highlight w:val="none"/>
+        </w:rPr>
+      </w:pPr>
+      <w:r>
+        <w:rPr>
+          <w:rFonts w:ascii="Liberation Sans" w:hAnsi="Liberation Sans" w:eastAsia="Liberation Sans" w:cs="Liberation Sans"/>
+          <w:b/>
+          <w:color w:val="auto"/>
+          <w:sz w:val="20"/>
+          <w:highlight w:val="none"/>
+        </w:rPr>
+        <w:t xml:space="preserve">Validar resposta básica</w:t>
+      </w:r>
+      <w:r>
+        <w:rPr>
+          <w:color w:val="auto"/>
+          <w:highlight w:val="none"/>
+        </w:rPr>
+      </w:r>
+    </w:p>
+    <w:p>
+      <w:pPr>
+        <w:pBdr/>
+        <w:spacing/>
+        <w:ind/>
+        <w:rPr>
+          <w:color w:val="auto"/>
+          <w:highlight w:val="none"/>
+        </w:rPr>
+      </w:pPr>
+      <w:r>
+        <w:rPr>
+          <w:rFonts w:ascii="Liberation Sans" w:hAnsi="Liberation Sans" w:eastAsia="Liberation Sans" w:cs="Liberation Sans"/>
+          <w:b/>
+          <w:color w:val="auto"/>
+          <w:sz w:val="20"/>
+          <w:highlight w:val="none"/>
+        </w:rPr>
+        <w:t xml:space="preserve">Configurar parâmetros específicos do 2.5 Pro</w:t>
+      </w:r>
+      <w:r>
+        <w:rPr>
+          <w:color w:val="auto"/>
+          <w:highlight w:val="none"/>
+        </w:rPr>
+      </w:r>
+    </w:p>
+    <w:p>
+      <w:pPr>
+        <w:pBdr/>
+        <w:spacing/>
+        <w:ind/>
+        <w:rPr>
+          <w:color w:val="auto"/>
+          <w:highlight w:val="none"/>
+        </w:rPr>
+      </w:pPr>
+      <w:r>
+        <w:rPr>
+          <w:rFonts w:ascii="Liberation Sans" w:hAnsi="Liberation Sans" w:eastAsia="Liberation Sans" w:cs="Liberation Sans"/>
+          <w:b/>
+          <w:color w:val="auto"/>
+          <w:sz w:val="22"/>
+          <w:highlight w:val="none"/>
+        </w:rPr>
+        <w:t xml:space="preserve">Passo 4: Carregamento de Modelos de Embedding</w:t>
+      </w:r>
+      <w:r>
+        <w:rPr>
+          <w:color w:val="auto"/>
+          <w:highlight w:val="none"/>
+        </w:rPr>
+      </w:r>
+    </w:p>
+    <w:p>
+      <w:pPr>
+        <w:pBdr/>
+        <w:spacing/>
+        <w:ind/>
+        <w:rPr>
+          <w:color w:val="auto"/>
+          <w:highlight w:val="none"/>
+        </w:rPr>
+      </w:pPr>
+      <w:r>
+        <w:rPr>
+          <w:rFonts w:ascii="Liberation Sans" w:hAnsi="Liberation Sans" w:eastAsia="Liberation Sans" w:cs="Liberation Sans"/>
+          <w:b/>
+          <w:color w:val="auto"/>
+          <w:sz w:val="20"/>
+          <w:highlight w:val="none"/>
+        </w:rPr>
+        <w:t xml:space="preserve">Inicializar Text Embedding Model (text-embedding-005)</w:t>
+      </w:r>
+      <w:r>
+        <w:rPr>
+          <w:color w:val="auto"/>
+          <w:highlight w:val="none"/>
+        </w:rPr>
+      </w:r>
+    </w:p>
+    <w:p>
+      <w:pPr>
+        <w:pBdr/>
+        <w:spacing/>
+        <w:ind/>
+        <w:rPr>
+          <w:color w:val="auto"/>
+          <w:highlight w:val="none"/>
+        </w:rPr>
+      </w:pPr>
+      <w:r>
+        <w:rPr>
+          <w:rFonts w:ascii="Liberation Sans" w:hAnsi="Liberation Sans" w:eastAsia="Liberation Sans" w:cs="Liberation Sans"/>
+          <w:b/>
+          <w:color w:val="auto"/>
+          <w:sz w:val="20"/>
+          <w:highlight w:val="none"/>
+        </w:rPr>
+        <w:t xml:space="preserve">Inicializar Multimodal Embedding Model (multimodalembedding@001)</w:t>
+      </w:r>
+      <w:r>
+        <w:rPr>
+          <w:color w:val="auto"/>
+          <w:highlight w:val="none"/>
+        </w:rPr>
+      </w:r>
+    </w:p>
+    <w:p>
+      <w:pPr>
+        <w:pBdr/>
+        <w:spacing/>
+        <w:ind/>
+        <w:rPr>
+          <w:color w:val="auto"/>
+          <w:highlight w:val="none"/>
+        </w:rPr>
+      </w:pPr>
+      <w:r>
+        <w:rPr>
+          <w:rFonts w:ascii="Liberation Sans" w:hAnsi="Liberation Sans" w:eastAsia="Liberation Sans" w:cs="Liberation Sans"/>
+          <w:b/>
+          <w:color w:val="auto"/>
+          <w:sz w:val="20"/>
+          <w:highlight w:val="none"/>
+        </w:rPr>
+        <w:t xml:space="preserve">Testar geração de embeddings</w:t>
+      </w:r>
+      <w:r>
+        <w:rPr>
+          <w:color w:val="auto"/>
+          <w:highlight w:val="none"/>
+        </w:rPr>
+      </w:r>
+    </w:p>
+    <w:p>
+      <w:pPr>
+        <w:pBdr/>
+        <w:spacing/>
+        <w:ind/>
+        <w:rPr>
+          <w:color w:val="auto"/>
+          <w:highlight w:val="none"/>
+        </w:rPr>
+      </w:pPr>
+      <w:r>
+        <w:rPr>
+          <w:rFonts w:ascii="Liberation Sans" w:hAnsi="Liberation Sans" w:eastAsia="Liberation Sans" w:cs="Liberation Sans"/>
+          <w:b/>
+          <w:color w:val="auto"/>
+          <w:sz w:val="20"/>
+          <w:highlight w:val="none"/>
+        </w:rPr>
+        <w:t xml:space="preserve">Validar dimensões configuradas</w:t>
+      </w:r>
+      <w:r>
+        <w:rPr>
+          <w:color w:val="auto"/>
+          <w:highlight w:val="none"/>
+        </w:rPr>
+      </w:r>
+    </w:p>
+    <w:p>
+      <w:pPr>
+        <w:pBdr/>
+        <w:spacing/>
+        <w:ind/>
+        <w:rPr>
+          <w:color w:val="auto"/>
+          <w:highlight w:val="none"/>
+        </w:rPr>
+      </w:pPr>
+      <w:r>
+        <w:rPr>
+          <w:rFonts w:ascii="Liberation Sans" w:hAnsi="Liberation Sans" w:eastAsia="Liberation Sans" w:cs="Liberation Sans"/>
+          <w:b/>
+          <w:color w:val="auto"/>
+          <w:sz w:val="22"/>
+          <w:highlight w:val="none"/>
+        </w:rPr>
+        <w:t xml:space="preserve">Passo 5: Verificação de Recursos</w:t>
+      </w:r>
+      <w:r>
+        <w:rPr>
+          <w:color w:val="auto"/>
+          <w:highlight w:val="none"/>
+        </w:rPr>
+      </w:r>
+    </w:p>
+    <w:p>
+      <w:pPr>
+        <w:pBdr/>
+        <w:spacing/>
+        <w:ind/>
+        <w:rPr>
+          <w:color w:val="auto"/>
+          <w:highlight w:val="none"/>
+        </w:rPr>
+      </w:pPr>
+      <w:r>
+        <w:rPr>
+          <w:rFonts w:ascii="Liberation Sans" w:hAnsi="Liberation Sans" w:eastAsia="Liberation Sans" w:cs="Liberation Sans"/>
+          <w:b/>
+          <w:color w:val="auto"/>
+          <w:sz w:val="20"/>
+          <w:highlight w:val="none"/>
+        </w:rPr>
+        <w:t xml:space="preserve">Verificar acesso ao Google Cloud</w:t>
+      </w:r>
+      <w:r>
+        <w:rPr>
+          <w:color w:val="auto"/>
+          <w:highlight w:val="none"/>
+        </w:rPr>
+      </w:r>
+    </w:p>
+    <w:p>
+      <w:pPr>
+        <w:pBdr/>
+        <w:spacing/>
+        <w:ind/>
+        <w:rPr>
+          <w:color w:val="auto"/>
+          <w:highlight w:val="none"/>
+        </w:rPr>
+      </w:pPr>
+      <w:r>
+        <w:rPr>
+          <w:rFonts w:ascii="Liberation Sans" w:hAnsi="Liberation Sans" w:eastAsia="Liberation Sans" w:cs="Liberation Sans"/>
+          <w:b/>
+          <w:color w:val="auto"/>
+          <w:sz w:val="20"/>
+          <w:highlight w:val="none"/>
+        </w:rPr>
+        <w:t xml:space="preserve">Validar quotas de API</w:t>
+      </w:r>
+      <w:r>
+        <w:rPr>
+          <w:color w:val="auto"/>
+          <w:highlight w:val="none"/>
+        </w:rPr>
+      </w:r>
+    </w:p>
+    <w:p>
+      <w:pPr>
+        <w:pBdr/>
+        <w:spacing/>
+        <w:ind/>
+        <w:rPr>
+          <w:color w:val="auto"/>
+          <w:highlight w:val="none"/>
+        </w:rPr>
+      </w:pPr>
+      <w:r>
+        <w:rPr>
+          <w:rFonts w:ascii="Liberation Sans" w:hAnsi="Liberation Sans" w:eastAsia="Liberation Sans" w:cs="Liberation Sans"/>
+          <w:b/>
+          <w:color w:val="auto"/>
+          <w:sz w:val="20"/>
+          <w:highlight w:val="none"/>
+        </w:rPr>
+        <w:t xml:space="preserve">Checar estrutura de diretórios</w:t>
+      </w:r>
+      <w:r>
+        <w:rPr>
+          <w:color w:val="auto"/>
+          <w:highlight w:val="none"/>
+        </w:rPr>
+      </w:r>
+    </w:p>
+    <w:p>
+      <w:pPr>
+        <w:pBdr/>
+        <w:spacing/>
+        <w:ind/>
+        <w:rPr>
+          <w:color w:val="auto"/>
+          <w:highlight w:val="none"/>
+        </w:rPr>
+      </w:pPr>
+      <w:r>
+        <w:rPr>
+          <w:rFonts w:ascii="Liberation Sans" w:hAnsi="Liberation Sans" w:eastAsia="Liberation Sans" w:cs="Liberation Sans"/>
+          <w:b/>
+          <w:color w:val="auto"/>
+          <w:sz w:val="20"/>
+          <w:highlight w:val="none"/>
+        </w:rPr>
+        <w:t xml:space="preserve">Testar conectividade de rede</w:t>
+      </w:r>
+      <w:r>
+        <w:rPr>
+          <w:color w:val="auto"/>
+          <w:highlight w:val="none"/>
+        </w:rPr>
+      </w:r>
+    </w:p>
+    <w:p>
+      <w:pPr>
+        <w:pBdr/>
+        <w:spacing/>
+        <w:ind/>
+        <w:rPr>
+          <w:color w:val="auto"/>
+          <w:highlight w:val="none"/>
+        </w:rPr>
+      </w:pPr>
+      <w:r>
+        <w:rPr>
+          <w:rFonts w:ascii="Liberation Sans" w:hAnsi="Liberation Sans" w:eastAsia="Liberation Sans" w:cs="Liberation Sans"/>
+          <w:b/>
+          <w:color w:val="auto"/>
+          <w:sz w:val="20"/>
+          <w:highlight w:val="none"/>
+        </w:rPr>
+        <w:t xml:space="preserve">Validar permissões de arquivo</w:t>
+      </w:r>
+      <w:r>
+        <w:rPr>
+          <w:color w:val="auto"/>
+          <w:highlight w:val="none"/>
+        </w:rPr>
+      </w:r>
+    </w:p>
+    <w:p>
+      <w:pPr>
+        <w:pBdr/>
+        <w:spacing/>
+        <w:ind/>
+        <w:rPr>
+          <w:color w:val="auto"/>
+          <w:highlight w:val="none"/>
+        </w:rPr>
+      </w:pPr>
+      <w:r>
+        <w:rPr>
+          <w:color w:val="auto"/>
+          <w:highlight w:val="none"/>
+        </w:rPr>
+      </w:r>
+      <w:r>
+        <w:rPr>
+          <w:color w:val="auto"/>
+          <w:highlight w:val="none"/>
+        </w:rPr>
+      </w:r>
+      <w:r>
+        <w:rPr>
+          <w:color w:val="auto"/>
+          <w:highlight w:val="none"/>
+        </w:rPr>
+      </w:r>
+    </w:p>
     <w:sectPr>
       <w:footnotePr/>
       <w:endnotePr/>
@@ -1459,6 +2345,651 @@
   </w:abstractNum>
   <w:abstractNum w:abstractNumId="5">
     <w:nsid w:val="1188E6DB"/>
+    <w:lvl w:ilvl="0">
+      <w:isLgl w:val="false"/>
+      <w:lvlJc w:val="right"/>
+      <w:lvlText w:val="%1."/>
+      <w:numFmt w:val="decimal"/>
+      <w:pPr>
+        <w:pBdr/>
+        <w:spacing/>
+        <w:ind w:hanging="360" w:left="709"/>
+      </w:pPr>
+      <w:rPr/>
+      <w:start w:val="1"/>
+      <w:suff w:val="tab"/>
+    </w:lvl>
+    <w:lvl w:ilvl="1">
+      <w:isLgl w:val="false"/>
+      <w:lvlJc w:val="right"/>
+      <w:lvlText w:val="%2."/>
+      <w:numFmt w:val="decimal"/>
+      <w:pPr>
+        <w:pBdr/>
+        <w:spacing/>
+        <w:ind w:hanging="360" w:left="1429"/>
+      </w:pPr>
+      <w:rPr/>
+      <w:start w:val="1"/>
+      <w:suff w:val="tab"/>
+    </w:lvl>
+    <w:lvl w:ilvl="2">
+      <w:isLgl w:val="false"/>
+      <w:lvlJc w:val="right"/>
+      <w:lvlText w:val="%3."/>
+      <w:numFmt w:val="decimal"/>
+      <w:pPr>
+        <w:pBdr/>
+        <w:spacing/>
+        <w:ind w:hanging="360" w:left="2149"/>
+      </w:pPr>
+      <w:rPr/>
+      <w:start w:val="1"/>
+      <w:suff w:val="tab"/>
+    </w:lvl>
+    <w:lvl w:ilvl="3">
+      <w:isLgl w:val="false"/>
+      <w:lvlJc w:val="right"/>
+      <w:lvlText w:val="%4."/>
+      <w:numFmt w:val="decimal"/>
+      <w:pPr>
+        <w:pBdr/>
+        <w:spacing/>
+        <w:ind w:hanging="360" w:left="2869"/>
+      </w:pPr>
+      <w:rPr/>
+      <w:start w:val="1"/>
+      <w:suff w:val="tab"/>
+    </w:lvl>
+    <w:lvl w:ilvl="4">
+      <w:isLgl w:val="false"/>
+      <w:lvlJc w:val="right"/>
+      <w:lvlText w:val="%5."/>
+      <w:numFmt w:val="decimal"/>
+      <w:pPr>
+        <w:pBdr/>
+        <w:spacing/>
+        <w:ind w:hanging="360" w:left="3589"/>
+      </w:pPr>
+      <w:rPr/>
+      <w:start w:val="1"/>
+      <w:suff w:val="tab"/>
+    </w:lvl>
+    <w:lvl w:ilvl="5">
+      <w:isLgl w:val="false"/>
+      <w:lvlJc w:val="right"/>
+      <w:lvlText w:val="%6."/>
+      <w:numFmt w:val="decimal"/>
+      <w:pPr>
+        <w:pBdr/>
+        <w:spacing/>
+        <w:ind w:hanging="360" w:left="4309"/>
+      </w:pPr>
+      <w:rPr/>
+      <w:start w:val="1"/>
+      <w:suff w:val="tab"/>
+    </w:lvl>
+    <w:lvl w:ilvl="6">
+      <w:isLgl w:val="false"/>
+      <w:lvlJc w:val="right"/>
+      <w:lvlText w:val="%7."/>
+      <w:numFmt w:val="decimal"/>
+      <w:pPr>
+        <w:pBdr/>
+        <w:spacing/>
+        <w:ind w:hanging="360" w:left="5029"/>
+      </w:pPr>
+      <w:rPr/>
+      <w:start w:val="1"/>
+      <w:suff w:val="tab"/>
+    </w:lvl>
+    <w:lvl w:ilvl="7">
+      <w:isLgl w:val="false"/>
+      <w:lvlJc w:val="right"/>
+      <w:lvlText w:val="%8."/>
+      <w:numFmt w:val="decimal"/>
+      <w:pPr>
+        <w:pBdr/>
+        <w:spacing/>
+        <w:ind w:hanging="360" w:left="5749"/>
+      </w:pPr>
+      <w:rPr/>
+      <w:start w:val="1"/>
+      <w:suff w:val="tab"/>
+    </w:lvl>
+    <w:lvl w:ilvl="8">
+      <w:isLgl w:val="false"/>
+      <w:lvlJc w:val="right"/>
+      <w:lvlText w:val="%9."/>
+      <w:numFmt w:val="decimal"/>
+      <w:pPr>
+        <w:pBdr/>
+        <w:spacing/>
+        <w:ind w:hanging="360" w:left="6469"/>
+      </w:pPr>
+      <w:rPr/>
+      <w:start w:val="1"/>
+      <w:suff w:val="tab"/>
+    </w:lvl>
+  </w:abstractNum>
+  <w:abstractNum w:abstractNumId="6">
+    <w:nsid w:val="3E417077"/>
+    <w:lvl w:ilvl="0">
+      <w:isLgl w:val="false"/>
+      <w:lvlJc w:val="right"/>
+      <w:lvlText w:val="%1."/>
+      <w:numFmt w:val="decimal"/>
+      <w:pPr>
+        <w:pBdr/>
+        <w:spacing/>
+        <w:ind w:hanging="360" w:left="709"/>
+      </w:pPr>
+      <w:rPr/>
+      <w:start w:val="1"/>
+      <w:suff w:val="tab"/>
+    </w:lvl>
+    <w:lvl w:ilvl="1">
+      <w:isLgl w:val="false"/>
+      <w:lvlJc w:val="right"/>
+      <w:lvlText w:val="%2."/>
+      <w:numFmt w:val="decimal"/>
+      <w:pPr>
+        <w:pBdr/>
+        <w:spacing/>
+        <w:ind w:hanging="360" w:left="1429"/>
+      </w:pPr>
+      <w:rPr/>
+      <w:start w:val="1"/>
+      <w:suff w:val="tab"/>
+    </w:lvl>
+    <w:lvl w:ilvl="2">
+      <w:isLgl w:val="false"/>
+      <w:lvlJc w:val="right"/>
+      <w:lvlText w:val="%3."/>
+      <w:numFmt w:val="decimal"/>
+      <w:pPr>
+        <w:pBdr/>
+        <w:spacing/>
+        <w:ind w:hanging="360" w:left="2149"/>
+      </w:pPr>
+      <w:rPr/>
+      <w:start w:val="1"/>
+      <w:suff w:val="tab"/>
+    </w:lvl>
+    <w:lvl w:ilvl="3">
+      <w:isLgl w:val="false"/>
+      <w:lvlJc w:val="right"/>
+      <w:lvlText w:val="%4."/>
+      <w:numFmt w:val="decimal"/>
+      <w:pPr>
+        <w:pBdr/>
+        <w:spacing/>
+        <w:ind w:hanging="360" w:left="2869"/>
+      </w:pPr>
+      <w:rPr/>
+      <w:start w:val="1"/>
+      <w:suff w:val="tab"/>
+    </w:lvl>
+    <w:lvl w:ilvl="4">
+      <w:isLgl w:val="false"/>
+      <w:lvlJc w:val="right"/>
+      <w:lvlText w:val="%5."/>
+      <w:numFmt w:val="decimal"/>
+      <w:pPr>
+        <w:pBdr/>
+        <w:spacing/>
+        <w:ind w:hanging="360" w:left="3589"/>
+      </w:pPr>
+      <w:rPr/>
+      <w:start w:val="1"/>
+      <w:suff w:val="tab"/>
+    </w:lvl>
+    <w:lvl w:ilvl="5">
+      <w:isLgl w:val="false"/>
+      <w:lvlJc w:val="right"/>
+      <w:lvlText w:val="%6."/>
+      <w:numFmt w:val="decimal"/>
+      <w:pPr>
+        <w:pBdr/>
+        <w:spacing/>
+        <w:ind w:hanging="360" w:left="4309"/>
+      </w:pPr>
+      <w:rPr/>
+      <w:start w:val="1"/>
+      <w:suff w:val="tab"/>
+    </w:lvl>
+    <w:lvl w:ilvl="6">
+      <w:isLgl w:val="false"/>
+      <w:lvlJc w:val="right"/>
+      <w:lvlText w:val="%7."/>
+      <w:numFmt w:val="decimal"/>
+      <w:pPr>
+        <w:pBdr/>
+        <w:spacing/>
+        <w:ind w:hanging="360" w:left="5029"/>
+      </w:pPr>
+      <w:rPr/>
+      <w:start w:val="1"/>
+      <w:suff w:val="tab"/>
+    </w:lvl>
+    <w:lvl w:ilvl="7">
+      <w:isLgl w:val="false"/>
+      <w:lvlJc w:val="right"/>
+      <w:lvlText w:val="%8."/>
+      <w:numFmt w:val="decimal"/>
+      <w:pPr>
+        <w:pBdr/>
+        <w:spacing/>
+        <w:ind w:hanging="360" w:left="5749"/>
+      </w:pPr>
+      <w:rPr/>
+      <w:start w:val="1"/>
+      <w:suff w:val="tab"/>
+    </w:lvl>
+    <w:lvl w:ilvl="8">
+      <w:isLgl w:val="false"/>
+      <w:lvlJc w:val="right"/>
+      <w:lvlText w:val="%9."/>
+      <w:numFmt w:val="decimal"/>
+      <w:pPr>
+        <w:pBdr/>
+        <w:spacing/>
+        <w:ind w:hanging="360" w:left="6469"/>
+      </w:pPr>
+      <w:rPr/>
+      <w:start w:val="1"/>
+      <w:suff w:val="tab"/>
+    </w:lvl>
+  </w:abstractNum>
+  <w:abstractNum w:abstractNumId="7">
+    <w:nsid w:val="36B7BDBC"/>
+    <w:lvl w:ilvl="0">
+      <w:isLgl w:val="false"/>
+      <w:lvlJc w:val="right"/>
+      <w:lvlText w:val="%1."/>
+      <w:numFmt w:val="decimal"/>
+      <w:pPr>
+        <w:pBdr/>
+        <w:spacing/>
+        <w:ind w:hanging="360" w:left="709"/>
+      </w:pPr>
+      <w:rPr/>
+      <w:start w:val="1"/>
+      <w:suff w:val="tab"/>
+    </w:lvl>
+    <w:lvl w:ilvl="1">
+      <w:isLgl w:val="false"/>
+      <w:lvlJc w:val="right"/>
+      <w:lvlText w:val="%2."/>
+      <w:numFmt w:val="decimal"/>
+      <w:pPr>
+        <w:pBdr/>
+        <w:spacing/>
+        <w:ind w:hanging="360" w:left="1429"/>
+      </w:pPr>
+      <w:rPr/>
+      <w:start w:val="1"/>
+      <w:suff w:val="tab"/>
+    </w:lvl>
+    <w:lvl w:ilvl="2">
+      <w:isLgl w:val="false"/>
+      <w:lvlJc w:val="right"/>
+      <w:lvlText w:val="%3."/>
+      <w:numFmt w:val="decimal"/>
+      <w:pPr>
+        <w:pBdr/>
+        <w:spacing/>
+        <w:ind w:hanging="360" w:left="2149"/>
+      </w:pPr>
+      <w:rPr/>
+      <w:start w:val="1"/>
+      <w:suff w:val="tab"/>
+    </w:lvl>
+    <w:lvl w:ilvl="3">
+      <w:isLgl w:val="false"/>
+      <w:lvlJc w:val="right"/>
+      <w:lvlText w:val="%4."/>
+      <w:numFmt w:val="decimal"/>
+      <w:pPr>
+        <w:pBdr/>
+        <w:spacing/>
+        <w:ind w:hanging="360" w:left="2869"/>
+      </w:pPr>
+      <w:rPr/>
+      <w:start w:val="1"/>
+      <w:suff w:val="tab"/>
+    </w:lvl>
+    <w:lvl w:ilvl="4">
+      <w:isLgl w:val="false"/>
+      <w:lvlJc w:val="right"/>
+      <w:lvlText w:val="%5."/>
+      <w:numFmt w:val="decimal"/>
+      <w:pPr>
+        <w:pBdr/>
+        <w:spacing/>
+        <w:ind w:hanging="360" w:left="3589"/>
+      </w:pPr>
+      <w:rPr/>
+      <w:start w:val="1"/>
+      <w:suff w:val="tab"/>
+    </w:lvl>
+    <w:lvl w:ilvl="5">
+      <w:isLgl w:val="false"/>
+      <w:lvlJc w:val="right"/>
+      <w:lvlText w:val="%6."/>
+      <w:numFmt w:val="decimal"/>
+      <w:pPr>
+        <w:pBdr/>
+        <w:spacing/>
+        <w:ind w:hanging="360" w:left="4309"/>
+      </w:pPr>
+      <w:rPr/>
+      <w:start w:val="1"/>
+      <w:suff w:val="tab"/>
+    </w:lvl>
+    <w:lvl w:ilvl="6">
+      <w:isLgl w:val="false"/>
+      <w:lvlJc w:val="right"/>
+      <w:lvlText w:val="%7."/>
+      <w:numFmt w:val="decimal"/>
+      <w:pPr>
+        <w:pBdr/>
+        <w:spacing/>
+        <w:ind w:hanging="360" w:left="5029"/>
+      </w:pPr>
+      <w:rPr/>
+      <w:start w:val="1"/>
+      <w:suff w:val="tab"/>
+    </w:lvl>
+    <w:lvl w:ilvl="7">
+      <w:isLgl w:val="false"/>
+      <w:lvlJc w:val="right"/>
+      <w:lvlText w:val="%8."/>
+      <w:numFmt w:val="decimal"/>
+      <w:pPr>
+        <w:pBdr/>
+        <w:spacing/>
+        <w:ind w:hanging="360" w:left="5749"/>
+      </w:pPr>
+      <w:rPr/>
+      <w:start w:val="1"/>
+      <w:suff w:val="tab"/>
+    </w:lvl>
+    <w:lvl w:ilvl="8">
+      <w:isLgl w:val="false"/>
+      <w:lvlJc w:val="right"/>
+      <w:lvlText w:val="%9."/>
+      <w:numFmt w:val="decimal"/>
+      <w:pPr>
+        <w:pBdr/>
+        <w:spacing/>
+        <w:ind w:hanging="360" w:left="6469"/>
+      </w:pPr>
+      <w:rPr/>
+      <w:start w:val="1"/>
+      <w:suff w:val="tab"/>
+    </w:lvl>
+  </w:abstractNum>
+  <w:abstractNum w:abstractNumId="8">
+    <w:nsid w:val="1E15B42D"/>
+    <w:lvl w:ilvl="0">
+      <w:isLgl w:val="false"/>
+      <w:lvlJc w:val="right"/>
+      <w:lvlText w:val="%1."/>
+      <w:numFmt w:val="decimal"/>
+      <w:pPr>
+        <w:pBdr/>
+        <w:spacing/>
+        <w:ind w:hanging="360" w:left="709"/>
+      </w:pPr>
+      <w:rPr/>
+      <w:start w:val="1"/>
+      <w:suff w:val="tab"/>
+    </w:lvl>
+    <w:lvl w:ilvl="1">
+      <w:isLgl w:val="false"/>
+      <w:lvlJc w:val="right"/>
+      <w:lvlText w:val="%2."/>
+      <w:numFmt w:val="decimal"/>
+      <w:pPr>
+        <w:pBdr/>
+        <w:spacing/>
+        <w:ind w:hanging="360" w:left="1429"/>
+      </w:pPr>
+      <w:rPr/>
+      <w:start w:val="1"/>
+      <w:suff w:val="tab"/>
+    </w:lvl>
+    <w:lvl w:ilvl="2">
+      <w:isLgl w:val="false"/>
+      <w:lvlJc w:val="right"/>
+      <w:lvlText w:val="%3."/>
+      <w:numFmt w:val="decimal"/>
+      <w:pPr>
+        <w:pBdr/>
+        <w:spacing/>
+        <w:ind w:hanging="360" w:left="2149"/>
+      </w:pPr>
+      <w:rPr/>
+      <w:start w:val="1"/>
+      <w:suff w:val="tab"/>
+    </w:lvl>
+    <w:lvl w:ilvl="3">
+      <w:isLgl w:val="false"/>
+      <w:lvlJc w:val="right"/>
+      <w:lvlText w:val="%4."/>
+      <w:numFmt w:val="decimal"/>
+      <w:pPr>
+        <w:pBdr/>
+        <w:spacing/>
+        <w:ind w:hanging="360" w:left="2869"/>
+      </w:pPr>
+      <w:rPr/>
+      <w:start w:val="1"/>
+      <w:suff w:val="tab"/>
+    </w:lvl>
+    <w:lvl w:ilvl="4">
+      <w:isLgl w:val="false"/>
+      <w:lvlJc w:val="right"/>
+      <w:lvlText w:val="%5."/>
+      <w:numFmt w:val="decimal"/>
+      <w:pPr>
+        <w:pBdr/>
+        <w:spacing/>
+        <w:ind w:hanging="360" w:left="3589"/>
+      </w:pPr>
+      <w:rPr/>
+      <w:start w:val="1"/>
+      <w:suff w:val="tab"/>
+    </w:lvl>
+    <w:lvl w:ilvl="5">
+      <w:isLgl w:val="false"/>
+      <w:lvlJc w:val="right"/>
+      <w:lvlText w:val="%6."/>
+      <w:numFmt w:val="decimal"/>
+      <w:pPr>
+        <w:pBdr/>
+        <w:spacing/>
+        <w:ind w:hanging="360" w:left="4309"/>
+      </w:pPr>
+      <w:rPr/>
+      <w:start w:val="1"/>
+      <w:suff w:val="tab"/>
+    </w:lvl>
+    <w:lvl w:ilvl="6">
+      <w:isLgl w:val="false"/>
+      <w:lvlJc w:val="right"/>
+      <w:lvlText w:val="%7."/>
+      <w:numFmt w:val="decimal"/>
+      <w:pPr>
+        <w:pBdr/>
+        <w:spacing/>
+        <w:ind w:hanging="360" w:left="5029"/>
+      </w:pPr>
+      <w:rPr/>
+      <w:start w:val="1"/>
+      <w:suff w:val="tab"/>
+    </w:lvl>
+    <w:lvl w:ilvl="7">
+      <w:isLgl w:val="false"/>
+      <w:lvlJc w:val="right"/>
+      <w:lvlText w:val="%8."/>
+      <w:numFmt w:val="decimal"/>
+      <w:pPr>
+        <w:pBdr/>
+        <w:spacing/>
+        <w:ind w:hanging="360" w:left="5749"/>
+      </w:pPr>
+      <w:rPr/>
+      <w:start w:val="1"/>
+      <w:suff w:val="tab"/>
+    </w:lvl>
+    <w:lvl w:ilvl="8">
+      <w:isLgl w:val="false"/>
+      <w:lvlJc w:val="right"/>
+      <w:lvlText w:val="%9."/>
+      <w:numFmt w:val="decimal"/>
+      <w:pPr>
+        <w:pBdr/>
+        <w:spacing/>
+        <w:ind w:hanging="360" w:left="6469"/>
+      </w:pPr>
+      <w:rPr/>
+      <w:start w:val="1"/>
+      <w:suff w:val="tab"/>
+    </w:lvl>
+  </w:abstractNum>
+  <w:abstractNum w:abstractNumId="9">
+    <w:nsid w:val="3A6F8E25"/>
+    <w:lvl w:ilvl="0">
+      <w:isLgl w:val="false"/>
+      <w:lvlJc w:val="right"/>
+      <w:lvlText w:val="%1."/>
+      <w:numFmt w:val="decimal"/>
+      <w:pPr>
+        <w:pBdr/>
+        <w:spacing/>
+        <w:ind w:hanging="360" w:left="709"/>
+      </w:pPr>
+      <w:rPr/>
+      <w:start w:val="1"/>
+      <w:suff w:val="tab"/>
+    </w:lvl>
+    <w:lvl w:ilvl="1">
+      <w:isLgl w:val="false"/>
+      <w:lvlJc w:val="right"/>
+      <w:lvlText w:val="%2."/>
+      <w:numFmt w:val="decimal"/>
+      <w:pPr>
+        <w:pBdr/>
+        <w:spacing/>
+        <w:ind w:hanging="360" w:left="1429"/>
+      </w:pPr>
+      <w:rPr/>
+      <w:start w:val="1"/>
+      <w:suff w:val="tab"/>
+    </w:lvl>
+    <w:lvl w:ilvl="2">
+      <w:isLgl w:val="false"/>
+      <w:lvlJc w:val="right"/>
+      <w:lvlText w:val="%3."/>
+      <w:numFmt w:val="decimal"/>
+      <w:pPr>
+        <w:pBdr/>
+        <w:spacing/>
+        <w:ind w:hanging="360" w:left="2149"/>
+      </w:pPr>
+      <w:rPr/>
+      <w:start w:val="1"/>
+      <w:suff w:val="tab"/>
+    </w:lvl>
+    <w:lvl w:ilvl="3">
+      <w:isLgl w:val="false"/>
+      <w:lvlJc w:val="right"/>
+      <w:lvlText w:val="%4."/>
+      <w:numFmt w:val="decimal"/>
+      <w:pPr>
+        <w:pBdr/>
+        <w:spacing/>
+        <w:ind w:hanging="360" w:left="2869"/>
+      </w:pPr>
+      <w:rPr/>
+      <w:start w:val="1"/>
+      <w:suff w:val="tab"/>
+    </w:lvl>
+    <w:lvl w:ilvl="4">
+      <w:isLgl w:val="false"/>
+      <w:lvlJc w:val="right"/>
+      <w:lvlText w:val="%5."/>
+      <w:numFmt w:val="decimal"/>
+      <w:pPr>
+        <w:pBdr/>
+        <w:spacing/>
+        <w:ind w:hanging="360" w:left="3589"/>
+      </w:pPr>
+      <w:rPr/>
+      <w:start w:val="1"/>
+      <w:suff w:val="tab"/>
+    </w:lvl>
+    <w:lvl w:ilvl="5">
+      <w:isLgl w:val="false"/>
+      <w:lvlJc w:val="right"/>
+      <w:lvlText w:val="%6."/>
+      <w:numFmt w:val="decimal"/>
+      <w:pPr>
+        <w:pBdr/>
+        <w:spacing/>
+        <w:ind w:hanging="360" w:left="4309"/>
+      </w:pPr>
+      <w:rPr/>
+      <w:start w:val="1"/>
+      <w:suff w:val="tab"/>
+    </w:lvl>
+    <w:lvl w:ilvl="6">
+      <w:isLgl w:val="false"/>
+      <w:lvlJc w:val="right"/>
+      <w:lvlText w:val="%7."/>
+      <w:numFmt w:val="decimal"/>
+      <w:pPr>
+        <w:pBdr/>
+        <w:spacing/>
+        <w:ind w:hanging="360" w:left="5029"/>
+      </w:pPr>
+      <w:rPr/>
+      <w:start w:val="1"/>
+      <w:suff w:val="tab"/>
+    </w:lvl>
+    <w:lvl w:ilvl="7">
+      <w:isLgl w:val="false"/>
+      <w:lvlJc w:val="right"/>
+      <w:lvlText w:val="%8."/>
+      <w:numFmt w:val="decimal"/>
+      <w:pPr>
+        <w:pBdr/>
+        <w:spacing/>
+        <w:ind w:hanging="360" w:left="5749"/>
+      </w:pPr>
+      <w:rPr/>
+      <w:start w:val="1"/>
+      <w:suff w:val="tab"/>
+    </w:lvl>
+    <w:lvl w:ilvl="8">
+      <w:isLgl w:val="false"/>
+      <w:lvlJc w:val="right"/>
+      <w:lvlText w:val="%9."/>
+      <w:numFmt w:val="decimal"/>
+      <w:pPr>
+        <w:pBdr/>
+        <w:spacing/>
+        <w:ind w:hanging="360" w:left="6469"/>
+      </w:pPr>
+      <w:rPr/>
+      <w:start w:val="1"/>
+      <w:suff w:val="tab"/>
+    </w:lvl>
+  </w:abstractNum>
+  <w:abstractNum w:abstractNumId="10">
+    <w:nsid w:val="1CFAB171"/>
     <w:lvl w:ilvl="0">
       <w:isLgl w:val="false"/>
       <w:lvlJc w:val="right"/>
@@ -1603,6 +3134,21 @@
   </w:num>
   <w:num w:numId="6">
     <w:abstractNumId w:val="5"/>
+  </w:num>
+  <w:num w:numId="7">
+    <w:abstractNumId w:val="6"/>
+  </w:num>
+  <w:num w:numId="8">
+    <w:abstractNumId w:val="7"/>
+  </w:num>
+  <w:num w:numId="9">
+    <w:abstractNumId w:val="8"/>
+  </w:num>
+  <w:num w:numId="10">
+    <w:abstractNumId w:val="9"/>
+  </w:num>
+  <w:num w:numId="11">
+    <w:abstractNumId w:val="10"/>
   </w:num>
 </w:numbering>
 </file>

</xml_diff>